<commit_message>
Add methodology for Paper 1 (Delphi) and Paper 2 (PLS-SEM), en/fa; align Paper 2 measurement wording
Co-Authored-By: Claude Sonnet 5.5 <noreply@anthropic.com>
Claude-Session: https://claude.ai/code/session_01QKbj24VsGxk6d97XVHWeWi
</commit_message>
<xml_diff>
--- a/paper2_intro_theory_en.docx
+++ b/paper2_intro_theory_en.docx
@@ -259,7 +259,7 @@
           <w:b w:val="0"/>
           <w:i w:val="0"/>
         </w:rPr>
-        <w:t>The companion study summarizes the validated components into six constructs that measure the extent and quality of assessment practices, not the entity's actual security (Table 1). Two features of the specification matter. First, the constructs form a chain: identification (TVI) and control evaluation (CCE) are inputs, residual-risk judgment (RRJ) is the judgment, and monitoring and learning (MOL) and process effectiveness (PEF) are what the judgment is for. Second, collaboration and competence (COL) is the conditioning construct. Within each construct the components are distinct facets rather than interchangeable symptoms (an asset inventory is not a substitute for a vulnerability review), so first-order components are best treated as formative indicators in a hierarchical specification; the final specification will follow the results of the companion study. Policy and scope, and legal requirements, enter as context variables, together with entity size, sector, respondent experience, professional certification and type of auditor.</w:t>
+        <w:t>The companion study summarizes the validated components into six constructs that measure the extent and quality of assessment practices, not the entity's actual security (Table 1). Two features of the specification matter. First, the constructs form a chain: identification (TVI) and control evaluation (CCE) are inputs, residual-risk judgment (RRJ) is the judgment, and monitoring and learning (MOL) and process effectiveness (PEF) are what the judgment is for. Second, collaboration and competence (COL) is the conditioning construct. Within each construct the components are distinct facets rather than interchangeable symptoms (an asset inventory is not a substitute for a vulnerability review), so the items that represent the components are best treated as formative indicators of their construct, whereas the outcome construct (PEF) is measured reflectively by items derived from its components; the final specification will follow the results of the companion study. Policy and scope, and legal requirements, enter as context variables, together with entity size, sector, respondent experience, professional certification and type of auditor.</w:t>
       </w:r>
     </w:p>
     <w:p>
@@ -440,7 +440,7 @@
                 <w:b w:val="0"/>
                 <w:sz w:val="17"/>
               </w:rPr>
-              <w:t>Proposed: first-order formative in hierarchical model</w:t>
+              <w:t>Proposed: formative composite of component items</w:t>
             </w:r>
           </w:p>
         </w:tc>
@@ -514,7 +514,7 @@
                 <w:b w:val="0"/>
                 <w:sz w:val="17"/>
               </w:rPr>
-              <w:t>Proposed: first-order formative in hierarchical model</w:t>
+              <w:t>Proposed: formative composite of component items</w:t>
             </w:r>
           </w:p>
         </w:tc>
@@ -588,7 +588,7 @@
                 <w:b w:val="0"/>
                 <w:sz w:val="17"/>
               </w:rPr>
-              <w:t>Proposed: first-order formative in hierarchical model</w:t>
+              <w:t>Proposed: formative composite of component items</w:t>
             </w:r>
           </w:p>
         </w:tc>
@@ -662,7 +662,7 @@
                 <w:b w:val="0"/>
                 <w:sz w:val="17"/>
               </w:rPr>
-              <w:t>Proposed: first-order formative in hierarchical model</w:t>
+              <w:t>Proposed: formative composite of component items</w:t>
             </w:r>
           </w:p>
         </w:tc>
@@ -736,7 +736,7 @@
                 <w:b w:val="0"/>
                 <w:sz w:val="17"/>
               </w:rPr>
-              <w:t>Proposed: first-order formative in hierarchical model</w:t>
+              <w:t>Proposed: formative composite of component items</w:t>
             </w:r>
           </w:p>
         </w:tc>
@@ -810,7 +810,7 @@
                 <w:b w:val="0"/>
                 <w:sz w:val="17"/>
               </w:rPr>
-              <w:t>Proposed: first-order formative in hierarchical model</w:t>
+              <w:t>Proposed: reflective outcome; items derived from the components</w:t>
             </w:r>
           </w:p>
         </w:tc>

</xml_diff>